<commit_message>
Added & Modified programs
</commit_message>
<xml_diff>
--- a/14_Linked Lists Part 1/Linked Lists.docx
+++ b/14_Linked Lists Part 1/Linked Lists.docx
@@ -89,39 +89,7 @@
           <w:sz w:val="34"/>
           <w:szCs w:val="34"/>
         </w:rPr>
-        <w:t xml:space="preserve">. 2 els are connected </w:t>
-      </w:r>
-      <w:proofErr w:type="spellStart"/>
-      <w:r>
-        <w:rPr>
-          <w:b/>
-          <w:bCs/>
-          <w:color w:val="000000" w:themeColor="text1"/>
-          <w:sz w:val="34"/>
-          <w:szCs w:val="34"/>
-        </w:rPr>
-        <w:t>thr</w:t>
-      </w:r>
-      <w:proofErr w:type="spellEnd"/>
-      <w:r>
-        <w:rPr>
-          <w:b/>
-          <w:bCs/>
-          <w:color w:val="000000" w:themeColor="text1"/>
-          <w:sz w:val="34"/>
-          <w:szCs w:val="34"/>
-        </w:rPr>
-        <w:t xml:space="preserve"> </w:t>
-      </w:r>
-      <w:r>
-        <w:rPr>
-          <w:b/>
-          <w:bCs/>
-          <w:color w:val="000000" w:themeColor="text1"/>
-          <w:sz w:val="34"/>
-          <w:szCs w:val="34"/>
-        </w:rPr>
-        <w:t>u a link</w:t>
+        <w:t>. 2 els are connected thru a link</w:t>
       </w:r>
       <w:r>
         <w:rPr>
@@ -1403,27 +1371,15 @@
         </w:rPr>
         <w:t xml:space="preserve">initialize the data field. </w:t>
       </w:r>
-      <w:proofErr w:type="gramStart"/>
-      <w:r>
-        <w:rPr>
-          <w:b/>
-          <w:bCs/>
-          <w:color w:val="000000" w:themeColor="text1"/>
-          <w:sz w:val="30"/>
-          <w:szCs w:val="30"/>
-        </w:rPr>
-        <w:t>So</w:t>
-      </w:r>
-      <w:proofErr w:type="gramEnd"/>
-      <w:r>
-        <w:rPr>
-          <w:b/>
-          <w:bCs/>
-          <w:color w:val="000000" w:themeColor="text1"/>
-          <w:sz w:val="30"/>
-          <w:szCs w:val="30"/>
-        </w:rPr>
-        <w:t xml:space="preserve"> we have to create a constructor explicitly. </w:t>
+      <w:r>
+        <w:rPr>
+          <w:b/>
+          <w:bCs/>
+          <w:color w:val="000000" w:themeColor="text1"/>
+          <w:sz w:val="30"/>
+          <w:szCs w:val="30"/>
+        </w:rPr>
+        <w:t xml:space="preserve">So we have to create a constructor explicitly. </w:t>
       </w:r>
       <w:r>
         <w:rPr>
@@ -2068,7 +2024,7 @@
                     <pic:cNvPicPr/>
                   </pic:nvPicPr>
                   <pic:blipFill>
-                    <a:blip r:embed="rId5"/>
+                    <a:blip r:embed="rId6"/>
                     <a:stretch>
                       <a:fillRect/>
                     </a:stretch>
@@ -5145,4 +5101,16 @@
     </a:ext>
   </a:extLst>
 </a:theme>
+</file>
+
+<file path=customXml/item1.xml><?xml version="1.0" encoding="utf-8"?>
+<b:Sources xmlns:b="http://schemas.openxmlformats.org/officeDocument/2006/bibliography" xmlns="http://schemas.openxmlformats.org/officeDocument/2006/bibliography" SelectedStyle="\APASixthEditionOfficeOnline.xsl" StyleName="APA" Version="6"/>
+</file>
+
+<file path=customXml/itemProps1.xml><?xml version="1.0" encoding="utf-8"?>
+<ds:datastoreItem xmlns:ds="http://schemas.openxmlformats.org/officeDocument/2006/customXml" ds:itemID="{9368C82F-6B03-4F82-9173-29E2A7E1F216}">
+  <ds:schemaRefs>
+    <ds:schemaRef ds:uri="http://schemas.openxmlformats.org/officeDocument/2006/bibliography"/>
+  </ds:schemaRefs>
+</ds:datastoreItem>
 </file>
</xml_diff>